<commit_message>
fix(odm-export): implement GxP serialization determinism and SAS metadata mappings
</commit_message>
<xml_diff>
--- a/test/fixtures/display-blocks/display-blocks-paper-crf.docx
+++ b/test/fixtures/display-blocks/display-blocks-paper-crf.docx
@@ -365,7 +365,11 @@
 <file path=word/styles.xml><?xml version="1.0" encoding="utf-8"?>
 <w:styles xmlns:mc="http://schemas.openxmlformats.org/markup-compatibility/2006" xmlns:r="http://schemas.openxmlformats.org/officeDocument/2006/relationships" xmlns:w="http://schemas.openxmlformats.org/wordprocessingml/2006/main" xmlns:w14="http://schemas.microsoft.com/office/word/2010/wordml" xmlns:w15="http://schemas.microsoft.com/office/word/2012/wordml" mc:Ignorable="w14 w15">
   <w:docDefaults>
-    <w:rPrDefault/>
+    <w:rPrDefault>
+      <w:rPr>
+        <w:lang w:val="en-US"/>
+      </w:rPr>
+    </w:rPrDefault>
     <w:pPrDefault/>
   </w:docDefaults>
   <w:style w:type="paragraph" w:styleId="Title">

</xml_diff>

<commit_message>
Refactor ODM and Docx builders to use ClinicalIterator with NATURAL sort
</commit_message>
<xml_diff>
--- a/test/fixtures/display-blocks/display-blocks-paper-crf.docx
+++ b/test/fixtures/display-blocks/display-blocks-paper-crf.docx
@@ -63,6 +63,28 @@
     </w:p>
     <w:p>
       <w:pPr>
+        <w:spacing w:after="150" w:before="150"/>
+      </w:pPr>
+      <w:r>
+        <w:rPr>
+          <w:sz w:val="22"/>
+          <w:szCs w:val="22"/>
+        </w:rPr>
+        <w:t xml:space="preserve">Subject ID</w:t>
+      </w:r>
+      <w:r>
+        <w:t xml:space="preserve">  </w:t>
+      </w:r>
+      <w:r>
+        <w:rPr>
+          <w:b/>
+          <w:bCs/>
+        </w:rPr>
+        <w:t xml:space="preserve"> ___________________________________</w:t>
+      </w:r>
+    </w:p>
+    <w:p>
+      <w:pPr>
         <w:spacing w:after="100" w:before="250"/>
       </w:pPr>
       <w:r>
@@ -73,6 +95,28 @@
           <w:szCs w:val="26"/>
         </w:rPr>
         <w:t xml:space="preserve">Demographics</w:t>
+      </w:r>
+    </w:p>
+    <w:p>
+      <w:pPr>
+        <w:spacing w:after="150" w:before="150"/>
+      </w:pPr>
+      <w:r>
+        <w:rPr>
+          <w:sz w:val="22"/>
+          <w:szCs w:val="22"/>
+        </w:rPr>
+        <w:t xml:space="preserve">Informed consent obtained?</w:t>
+      </w:r>
+      <w:r>
+        <w:t xml:space="preserve">  </w:t>
+      </w:r>
+      <w:r>
+        <w:rPr>
+          <w:b/>
+          <w:bCs/>
+        </w:rPr>
+        <w:t xml:space="preserve"> ___________________________________</w:t>
       </w:r>
     </w:p>
     <w:p>
@@ -92,55 +136,11 @@
     </w:p>
     <w:p>
       <w:pPr>
-        <w:spacing w:after="150" w:before="150"/>
-      </w:pPr>
-      <w:r>
-        <w:rPr>
-          <w:sz w:val="22"/>
-          <w:szCs w:val="22"/>
-        </w:rPr>
-        <w:t xml:space="preserve">Subject ID</w:t>
-      </w:r>
-      <w:r>
-        <w:t xml:space="preserve">  </w:t>
-      </w:r>
-      <w:r>
-        <w:rPr>
-          <w:b/>
-          <w:bCs/>
-        </w:rPr>
-        <w:t xml:space="preserve"> ___________________________________</w:t>
-      </w:r>
-    </w:p>
-    <w:p>
-      <w:pPr>
         <w:pBdr>
           <w:bottom w:val="single" w:color="808080" w:sz="6" w:space="1"/>
         </w:pBdr>
         <w:spacing w:after="150" w:before="150"/>
       </w:pPr>
-    </w:p>
-    <w:p>
-      <w:pPr>
-        <w:spacing w:after="150" w:before="150"/>
-      </w:pPr>
-      <w:r>
-        <w:rPr>
-          <w:sz w:val="22"/>
-          <w:szCs w:val="22"/>
-        </w:rPr>
-        <w:t xml:space="preserve">Informed consent obtained?</w:t>
-      </w:r>
-      <w:r>
-        <w:t xml:space="preserve">  </w:t>
-      </w:r>
-      <w:r>
-        <w:rPr>
-          <w:b/>
-          <w:bCs/>
-        </w:rPr>
-        <w:t xml:space="preserve"> ___________________________________</w:t>
-      </w:r>
     </w:p>
     <w:p>
       <w:pPr>

</xml_diff>